<commit_message>
mention reporting and data ETL experiences
</commit_message>
<xml_diff>
--- a/resume/Resume.docx
+++ b/resume/Resume.docx
@@ -237,6 +237,23 @@
           <w:color w:val="000000"/>
           <w:sz w:val="20"/>
         </w:rPr>
+        <w:t>Leading the migration of the enterprise ETL pipeline from Azure/Python to Snowflake/dbt across all clients, modernizing the data platform for scalability, governance, and self-service analytics.</w:t>
+      </w:r>
+    </w:p>
+    <w:p>
+      <w:pPr>
+        <w:pStyle w:val="ListBullet"/>
+        <w:spacing w:before="20" w:after="20"/>
+        <w:ind w:left="504" w:hanging="288"/>
+      </w:pPr>
+      <w:r>
+        <w:rPr>
+          <w:rFonts w:ascii="Calibri" w:hAnsi="Calibri"/>
+          <w:b w:val="0"/>
+          <w:i w:val="0"/>
+          <w:color w:val="000000"/>
+          <w:sz w:val="20"/>
+        </w:rPr>
         <w:t>Deployed AI-driven tooling for automated data discovery and QA validation, significantly reducing manual effort in ETL pipelines and data processing workflows.</w:t>
       </w:r>
     </w:p>
@@ -374,6 +391,23 @@
           <w:sz w:val="20"/>
         </w:rPr>
         <w:t>Built a comprehensive fraud analytics and reporting infrastructure on GCP BigQuery, Amazon S3, and REST-based integrations — enabling data-driven decision-making across fraud, finance, and executive leadership.</w:t>
+      </w:r>
+    </w:p>
+    <w:p>
+      <w:pPr>
+        <w:pStyle w:val="ListBullet"/>
+        <w:spacing w:before="20" w:after="20"/>
+        <w:ind w:left="504" w:hanging="288"/>
+      </w:pPr>
+      <w:r>
+        <w:rPr>
+          <w:rFonts w:ascii="Calibri" w:hAnsi="Calibri"/>
+          <w:b w:val="0"/>
+          <w:i w:val="0"/>
+          <w:color w:val="000000"/>
+          <w:sz w:val="20"/>
+        </w:rPr>
+        <w:t>Designed and built fraud and chargeback visualization dashboards, then drove company-wide adoption as the standard tool for tracking organizational and individual employee performance metrics.</w:t>
       </w:r>
     </w:p>
     <w:p>

</xml_diff>